<commit_message>
Add csv.html, navbar update, TOPSIS steps 3-7 scripts, Legends naming in docx
</commit_message>
<xml_diff>
--- a/Dokumen/Hasil_TOPSIS_Hosting_Minecraft.docx
+++ b/Dokumen/Hasil_TOPSIS_Hosting_Minecraft.docx
@@ -6238,7 +6238,7 @@
         <w:pStyle w:val="ListBullet"/>
       </w:pPr>
       <w:r>
-        <w:t xml:space="preserve">  w1 (Harga (USD/mo)) = 0.2</w:t>
+        <w:t xml:space="preserve">  Bobot_{Harga (USD/mo)} = 0.2</w:t>
       </w:r>
     </w:p>
     <w:p>
@@ -6246,7 +6246,7 @@
         <w:pStyle w:val="ListBullet"/>
       </w:pPr>
       <w:r>
-        <w:t xml:space="preserve">  w2 (RAM (GB)) = 0.2</w:t>
+        <w:t xml:space="preserve">  Bobot_{RAM (GB)} = 0.2</w:t>
       </w:r>
     </w:p>
     <w:p>
@@ -6254,7 +6254,7 @@
         <w:pStyle w:val="ListBullet"/>
       </w:pPr>
       <w:r>
-        <w:t xml:space="preserve">  w3 (Storage (GB)) = 0.1</w:t>
+        <w:t xml:space="preserve">  Bobot_{Storage (GB)} = 0.1</w:t>
       </w:r>
     </w:p>
     <w:p>
@@ -6262,7 +6262,7 @@
         <w:pStyle w:val="ListBullet"/>
       </w:pPr>
       <w:r>
-        <w:t xml:space="preserve">  w4 (Slot Pemain) = 0.1</w:t>
+        <w:t xml:space="preserve">  Bobot_{Slot Pemain} = 0.1</w:t>
       </w:r>
     </w:p>
     <w:p>
@@ -6270,7 +6270,7 @@
         <w:pStyle w:val="ListBullet"/>
       </w:pPr>
       <w:r>
-        <w:t xml:space="preserve">  w5 (Uptime (%)) = 0.25</w:t>
+        <w:t xml:space="preserve">  Bobot_{Uptime (%)} = 0.25</w:t>
       </w:r>
     </w:p>
     <w:p>
@@ -6278,7 +6278,7 @@
         <w:pStyle w:val="ListBullet"/>
       </w:pPr>
       <w:r>
-        <w:t xml:space="preserve">  w6 (vCPU) = 0.15</w:t>
+        <w:t xml:space="preserve">  Bobot_{vCPU} = 0.15</w:t>
       </w:r>
     </w:p>
     <w:p>
@@ -6301,7 +6301,7 @@
       <w:r>
         <w:drawing>
           <wp:inline xmlns:a="http://schemas.openxmlformats.org/drawingml/2006/main" xmlns:pic="http://schemas.openxmlformats.org/drawingml/2006/picture">
-            <wp:extent cx="4114800" cy="701837"/>
+            <wp:extent cx="4114800" cy="541709"/>
             <wp:docPr id="1" name="Picture 1"/>
             <wp:cNvGraphicFramePr>
               <a:graphicFrameLocks noChangeAspect="1"/>
@@ -6322,7 +6322,7 @@
                   <pic:spPr>
                     <a:xfrm>
                       <a:off x="0" y="0"/>
-                      <a:ext cx="4114800" cy="701837"/>
+                      <a:ext cx="4114800" cy="541709"/>
                     </a:xfrm>
                     <a:prstGeom prst="rect"/>
                   </pic:spPr>
@@ -18410,7 +18410,7 @@
     </w:p>
     <w:p>
       <w:r>
-        <w:t>Solusi ideal positif:</w:t>
+        <w:t>Solusi ideal positif (A+):</w:t>
       </w:r>
     </w:p>
     <w:p>
@@ -18454,7 +18454,7 @@
     </w:p>
     <w:p>
       <w:r>
-        <w:t>Solusi ideal negatif:</w:t>
+        <w:t>Solusi ideal negatif (A-):</w:t>
       </w:r>
     </w:p>
     <w:p>
@@ -18591,7 +18591,7 @@
           </w:tcPr>
           <w:p>
             <w:r>
-              <w:t>Positif (A+)</w:t>
+              <w:t>A+</w:t>
             </w:r>
           </w:p>
         </w:tc>
@@ -18601,7 +18601,7 @@
           </w:tcPr>
           <w:p>
             <w:r>
-              <w:t>0.000000 (cost)</w:t>
+              <w:t>0.000000</w:t>
             </w:r>
           </w:p>
         </w:tc>
@@ -18663,7 +18663,7 @@
           </w:tcPr>
           <w:p>
             <w:r>
-              <w:t>Negatif (A-)</w:t>
+              <w:t>A-</w:t>
             </w:r>
           </w:p>
         </w:tc>
@@ -18673,7 +18673,7 @@
           </w:tcPr>
           <w:p>
             <w:r>
-              <w:t>0.078401 (cost)</w:t>
+              <w:t>0.078401</w:t>
             </w:r>
           </w:p>
         </w:tc>
@@ -18740,7 +18740,7 @@
     </w:p>
     <w:p>
       <w:r>
-        <w:t>Rumus jarak positif:</w:t>
+        <w:t>Rumus jarak positif (D+):</w:t>
       </w:r>
     </w:p>
     <w:p>
@@ -18750,7 +18750,7 @@
       <w:r>
         <w:drawing>
           <wp:inline xmlns:a="http://schemas.openxmlformats.org/drawingml/2006/main" xmlns:pic="http://schemas.openxmlformats.org/drawingml/2006/picture">
-            <wp:extent cx="4114800" cy="707497"/>
+            <wp:extent cx="4114800" cy="560337"/>
             <wp:docPr id="5" name="Picture 5"/>
             <wp:cNvGraphicFramePr>
               <a:graphicFrameLocks noChangeAspect="1"/>
@@ -18771,7 +18771,7 @@
                   <pic:spPr>
                     <a:xfrm>
                       <a:off x="0" y="0"/>
-                      <a:ext cx="4114800" cy="707497"/>
+                      <a:ext cx="4114800" cy="560337"/>
                     </a:xfrm>
                     <a:prstGeom prst="rect"/>
                   </pic:spPr>
@@ -18784,7 +18784,7 @@
     </w:p>
     <w:p>
       <w:r>
-        <w:t>Rumus jarak negatif:</w:t>
+        <w:t>Rumus jarak negatif (D-):</w:t>
       </w:r>
     </w:p>
     <w:p>
@@ -18794,7 +18794,7 @@
       <w:r>
         <w:drawing>
           <wp:inline xmlns:a="http://schemas.openxmlformats.org/drawingml/2006/main" xmlns:pic="http://schemas.openxmlformats.org/drawingml/2006/picture">
-            <wp:extent cx="4114800" cy="707497"/>
+            <wp:extent cx="4114800" cy="560337"/>
             <wp:docPr id="6" name="Picture 6"/>
             <wp:cNvGraphicFramePr>
               <a:graphicFrameLocks noChangeAspect="1"/>
@@ -18815,7 +18815,7 @@
                   <pic:spPr>
                     <a:xfrm>
                       <a:off x="0" y="0"/>
-                      <a:ext cx="4114800" cy="707497"/>
+                      <a:ext cx="4114800" cy="560337"/>
                     </a:xfrm>
                     <a:prstGeom prst="rect"/>
                   </pic:spPr>
@@ -18828,7 +18828,7 @@
     </w:p>
     <w:p>
       <w:r>
-        <w:t>Rumus preferensi:</w:t>
+        <w:t>Rumus preferensi (V):</w:t>
       </w:r>
     </w:p>
     <w:p>
@@ -18931,7 +18931,7 @@
           </w:tcPr>
           <w:p>
             <w:r>
-              <w:t>V (Preferensi)</w:t>
+              <w:t>V</w:t>
             </w:r>
           </w:p>
         </w:tc>
@@ -25644,7 +25644,7 @@
     </w:p>
     <w:p>
       <w:r>
-        <w:t>Berdasarkan perhitungan TOPSIS dengan bobot {'Harga (USD/mo)': 0.2, 'RAM (GB)': 0.2, 'Storage (GB)': 0.1, 'Slot Pemain': 0.1, 'Uptime (%)': 0.25, 'vCPU': 0.15}, alternatif terbaik adalah Hostinger - Panel8 dengan nilai preferensi V = 0.809643.</w:t>
+        <w:t>Berdasarkan perhitungan TOPSIS dengan bobot {'Harga (USD/mo)': 0.2, 'RAM (GB)': 0.2, 'Storage (GB)': 0.1, 'Slot Pemain': 0.1, 'Uptime (%)': 0.25, 'vCPU': 0.15}, alternatif terbaik adalah Hostinger - Panel8 dengan nilai V = 0.809643.</w:t>
       </w:r>
     </w:p>
     <w:p>

</xml_diff>